<commit_message>
Refactored forms and regenerated docx templates from source
</commit_message>
<xml_diff>
--- a/munientry-poc/api/Templates/Driving_Privileges_Template.docx
+++ b/munientry-poc/api/Templates/Driving_Privileges_Template.docx
@@ -337,27 +337,7 @@
                 <w:sz w:val="20"/>
                 <w:szCs w:val="20"/>
               </w:rPr>
-              <w:t xml:space="preserve"> </w:t>
-            </w:r>
-            <w:r>
-              <w:rPr>
-                <w:rFonts w:cstheme="minorHAnsi"/>
-                <w:b/>
-                <w:bCs/>
-                <w:sz w:val="20"/>
-                <w:szCs w:val="20"/>
-              </w:rPr>
               <w:t>{BmvCases}</w:t>
-            </w:r>
-            <w:r>
-              <w:rPr>
-                <w:rFonts w:cstheme="minorHAnsi"/>
-                <w:b/>
-                <w:bCs/>
-                <w:sz w:val="20"/>
-                <w:szCs w:val="20"/>
-              </w:rPr>
-              <w:t/>
             </w:r>
           </w:p>
         </w:tc>
@@ -495,7 +475,7 @@
           <w:sz w:val="20"/>
           <w:szCs w:val="20"/>
         </w:rPr>
-        <w:t>, as stated below, to and from home, including reasonable commute time, starting on the file-stamped date of this entry. No CDL Privileges.{{‘\n\n’}}BMV Reinstatement Fees. Petitioner cannot reasonably pay reinstatement fee(s) and would be valid to drive but for said fees. Payment Plan: $50/month until fully paid. Privileges are valid upon receipt by OBMV of 1st payment within 30 days hereof and subject to timely payment thereafter; full privileges restored when fees fully paid and all suspensions cleared. (BMV 2821).</w:t>
+        <w:t>, as stated below, to and from home, including reasonable commute time, starting on the file-stamped date of this entry. No CDL Privileges.BMV Reinstatement Fees. Petitioner cannot reasonably pay reinstatement fee(s) and would be valid to drive but for said fees. Payment Plan: $50/month until fully paid. Privileges are valid upon receipt by OBMV of 1st payment within 30 days hereof and subject to timely payment thereafter; full privileges restored when fees fully paid and all suspensions cleared. (BMV 2821).</w:t>
       </w:r>
     </w:p>
     <w:tbl>
@@ -692,14 +672,6 @@
                 <w:szCs w:val="20"/>
               </w:rPr>
             </w:pPr>
-            <w:r>
-              <w:rPr>
-                <w:rFonts w:cstheme="minorHAnsi"/>
-                <w:sz w:val="20"/>
-                <w:szCs w:val="20"/>
-              </w:rPr>
-              <w:t/>
-            </w:r>
           </w:p>
         </w:tc>
         <w:tc>
@@ -736,14 +708,6 @@
                 <w:szCs w:val="20"/>
               </w:rPr>
             </w:pPr>
-            <w:r>
-              <w:rPr>
-                <w:rFonts w:cstheme="minorHAnsi"/>
-                <w:sz w:val="20"/>
-                <w:szCs w:val="20"/>
-              </w:rPr>
-              <w:t/>
-            </w:r>
           </w:p>
         </w:tc>
       </w:tr>
@@ -798,14 +762,6 @@
                 <w:szCs w:val="20"/>
               </w:rPr>
             </w:pPr>
-            <w:r>
-              <w:rPr>
-                <w:rFonts w:cstheme="minorHAnsi"/>
-                <w:sz w:val="20"/>
-                <w:szCs w:val="20"/>
-              </w:rPr>
-              <w:t/>
-            </w:r>
           </w:p>
         </w:tc>
         <w:tc>
@@ -842,14 +798,6 @@
                 <w:szCs w:val="20"/>
               </w:rPr>
             </w:pPr>
-            <w:r>
-              <w:rPr>
-                <w:rFonts w:cstheme="minorHAnsi"/>
-                <w:sz w:val="20"/>
-                <w:szCs w:val="20"/>
-              </w:rPr>
-              <w:t/>
-            </w:r>
           </w:p>
         </w:tc>
       </w:tr>
@@ -904,14 +852,6 @@
                 <w:szCs w:val="20"/>
               </w:rPr>
             </w:pPr>
-            <w:r>
-              <w:rPr>
-                <w:rFonts w:cstheme="minorHAnsi"/>
-                <w:sz w:val="20"/>
-                <w:szCs w:val="20"/>
-              </w:rPr>
-              <w:t/>
-            </w:r>
           </w:p>
         </w:tc>
         <w:tc>
@@ -996,14 +936,6 @@
                 <w:szCs w:val="20"/>
               </w:rPr>
             </w:pPr>
-            <w:r>
-              <w:rPr>
-                <w:rFonts w:cstheme="minorHAnsi"/>
-                <w:sz w:val="20"/>
-                <w:szCs w:val="20"/>
-              </w:rPr>
-              <w:t/>
-            </w:r>
           </w:p>
         </w:tc>
       </w:tr>
@@ -1048,14 +980,6 @@
                 <w:szCs w:val="20"/>
               </w:rPr>
             </w:pPr>
-            <w:r>
-              <w:rPr>
-                <w:rFonts w:cstheme="minorHAnsi"/>
-                <w:sz w:val="20"/>
-                <w:szCs w:val="20"/>
-              </w:rPr>
-              <w:t/>
-            </w:r>
           </w:p>
         </w:tc>
         <w:tc>
@@ -1092,14 +1016,6 @@
                 <w:szCs w:val="20"/>
               </w:rPr>
             </w:pPr>
-            <w:r>
-              <w:rPr>
-                <w:rFonts w:cstheme="minorHAnsi"/>
-                <w:sz w:val="20"/>
-                <w:szCs w:val="20"/>
-              </w:rPr>
-              <w:t/>
-            </w:r>
           </w:p>
         </w:tc>
       </w:tr>
@@ -1144,14 +1060,6 @@
                 <w:szCs w:val="20"/>
               </w:rPr>
             </w:pPr>
-            <w:r>
-              <w:rPr>
-                <w:rFonts w:cstheme="minorHAnsi"/>
-                <w:sz w:val="20"/>
-                <w:szCs w:val="20"/>
-              </w:rPr>
-              <w:t/>
-            </w:r>
           </w:p>
         </w:tc>
         <w:tc>
@@ -1188,14 +1096,6 @@
                 <w:szCs w:val="20"/>
               </w:rPr>
             </w:pPr>
-            <w:r>
-              <w:rPr>
-                <w:rFonts w:cstheme="minorHAnsi"/>
-                <w:sz w:val="20"/>
-                <w:szCs w:val="20"/>
-              </w:rPr>
-              <w:t/>
-            </w:r>
           </w:p>
         </w:tc>
       </w:tr>
@@ -1240,14 +1140,6 @@
                 <w:szCs w:val="20"/>
               </w:rPr>
             </w:pPr>
-            <w:r>
-              <w:rPr>
-                <w:rFonts w:cstheme="minorHAnsi"/>
-                <w:sz w:val="20"/>
-                <w:szCs w:val="20"/>
-              </w:rPr>
-              <w:t/>
-            </w:r>
           </w:p>
         </w:tc>
         <w:tc>
@@ -1284,14 +1176,6 @@
                 <w:szCs w:val="20"/>
               </w:rPr>
             </w:pPr>
-            <w:r>
-              <w:rPr>
-                <w:rFonts w:cstheme="minorHAnsi"/>
-                <w:sz w:val="20"/>
-                <w:szCs w:val="20"/>
-              </w:rPr>
-              <w:t/>
-            </w:r>
           </w:p>
         </w:tc>
       </w:tr>
@@ -1327,7 +1211,7 @@
           <w:sz w:val="20"/>
           <w:szCs w:val="20"/>
         </w:rPr>
-        <w:t>) for which they still owe fines/costs; the Court has jurisdiction pursuant to R.C. 4510.73.{{‘\n\n’}}</w:t>
+        <w:t>) for which they still owe fines/costs; the Court has jurisdiction pursuant to R.C. 4510.73.</w:t>
       </w:r>
       <w:r>
         <w:rPr>
@@ -1343,7 +1227,7 @@
           <w:sz w:val="20"/>
           <w:szCs w:val="20"/>
         </w:rPr>
-        <w:t xml:space="preserve">{{‘\n’}}REQUIREMENTS. When operating a vehicle Defendant shall: </w:t>
+        <w:t xml:space="preserve">REQUIREMENTS. When operating a vehicle Defendant shall: </w:t>
       </w:r>
     </w:p>
     <w:p>
@@ -1554,83 +1438,7 @@
           <w:sz w:val="20"/>
           <w:szCs w:val="20"/>
         </w:rPr>
-        <w:t/>
-      </w:r>
-      <w:r>
-        <w:rPr>
-          <w:rFonts w:cstheme="minorHAnsi"/>
-          <w:b/>
-          <w:bCs/>
-          <w:sz w:val="20"/>
-          <w:szCs w:val="20"/>
-        </w:rPr>
-        <w:t>DRIVING RESTRICTIONS</w:t>
-      </w:r>
-      <w:r>
-        <w:rPr>
-          <w:rFonts w:cstheme="minorHAnsi"/>
-          <w:b/>
-          <w:bCs/>
-          <w:sz w:val="20"/>
-          <w:szCs w:val="20"/>
-        </w:rPr>
-        <w:t xml:space="preserve">. </w:t>
-      </w:r>
-      <w:r>
-        <w:rPr>
-          <w:rFonts w:cstheme="minorHAnsi"/>
-          <w:sz w:val="20"/>
-          <w:szCs w:val="20"/>
-        </w:rPr>
-        <w:t>Restrictions</w:t>
-      </w:r>
-      <w:r>
-        <w:rPr>
-          <w:rFonts w:cstheme="minorHAnsi"/>
-          <w:sz w:val="20"/>
-          <w:szCs w:val="20"/>
-        </w:rPr>
-        <w:t xml:space="preserve"> listed are not required on employer owned (excluding businesses partly or wholly owned or controlled by </w:t>
-      </w:r>
-      <w:r>
-        <w:rPr>
-          <w:rFonts w:cstheme="minorHAnsi"/>
-          <w:sz w:val="20"/>
-          <w:szCs w:val="20"/>
-        </w:rPr>
-        <w:t>Defendant</w:t>
-      </w:r>
-      <w:r>
-        <w:rPr>
-          <w:rFonts w:cstheme="minorHAnsi"/>
-          <w:sz w:val="20"/>
-          <w:szCs w:val="20"/>
-        </w:rPr>
-        <w:t xml:space="preserve">) vehicle not used for commuting purposes </w:t>
-      </w:r>
-      <w:r>
-        <w:rPr>
-          <w:rFonts w:cstheme="minorHAnsi"/>
-          <w:sz w:val="20"/>
-          <w:szCs w:val="20"/>
-        </w:rPr>
-        <w:t>if</w:t>
-      </w:r>
-      <w:r>
-        <w:rPr>
-          <w:rFonts w:cstheme="minorHAnsi"/>
-          <w:sz w:val="20"/>
-          <w:szCs w:val="20"/>
-        </w:rPr>
-        <w:t xml:space="preserve"> employer/supervisor acknowledges notice of this restriction. R.C. 4503.231(B), 4510.43(C).</w:t>
-      </w:r>
-      <w:r>
-        <w:rPr>
-          <w:rFonts w:cstheme="minorHAnsi"/>
-          <w:sz w:val="20"/>
-          <w:szCs w:val="20"/>
-        </w:rPr>
-        <w:t xml:space="preserve"/>
+        <w:t>DRIVING RESTRICTIONS. Restrictions listed are not required on employer owned (excluding businesses partly or wholly owned or controlled by Defendant) vehicle not used for commuting purposes if employer/supervisor acknowledges notice of this restriction. R.C. 4503.231(B), 4510.43(C).</w:t>
       </w:r>
     </w:p>
     <w:p>
@@ -1655,87 +1463,7 @@
           <w:sz w:val="20"/>
           <w:szCs w:val="20"/>
         </w:rPr>
-        <w:t xml:space="preserve">Restricted Vehicle ID Tags Required. </w:t>
-      </w:r>
-      <w:r>
-        <w:rPr>
-          <w:rFonts w:cstheme="minorHAnsi"/>
-          <w:sz w:val="20"/>
-          <w:szCs w:val="20"/>
-        </w:rPr>
-        <w:t>Defendant</w:t>
-      </w:r>
-      <w:r>
-        <w:rPr>
-          <w:rFonts w:cstheme="minorHAnsi"/>
-          <w:sz w:val="20"/>
-          <w:szCs w:val="20"/>
-        </w:rPr>
-        <w:t xml:space="preserve"> shall only operate a vehicle with</w:t>
-      </w:r>
-      <w:r>
-        <w:rPr>
-          <w:rFonts w:cstheme="minorHAnsi"/>
-          <w:sz w:val="20"/>
-          <w:szCs w:val="20"/>
-        </w:rPr>
-        <w:t xml:space="preserve"> unobscured restricted I.D. tags p</w:t>
-      </w:r>
-      <w:r>
-        <w:rPr>
-          <w:rFonts w:cstheme="minorHAnsi"/>
-          <w:sz w:val="20"/>
-          <w:szCs w:val="20"/>
-        </w:rPr>
-        <w:t>ursuant to R.C.</w:t>
-      </w:r>
-      <w:r>
-        <w:rPr>
-          <w:rFonts w:cstheme="minorHAnsi"/>
-          <w:sz w:val="20"/>
-          <w:szCs w:val="20"/>
-        </w:rPr>
-        <w:t xml:space="preserve"> 4503.2131</w:t>
-      </w:r>
-      <w:r>
-        <w:rPr>
-          <w:rFonts w:cstheme="minorHAnsi"/>
-          <w:sz w:val="20"/>
-          <w:szCs w:val="20"/>
-        </w:rPr>
-        <w:t xml:space="preserve"> and </w:t>
-      </w:r>
-      <w:r>
-        <w:rPr>
-          <w:rFonts w:cstheme="minorHAnsi"/>
-          <w:sz w:val="20"/>
-          <w:szCs w:val="20"/>
-        </w:rPr>
-        <w:t xml:space="preserve">R.C. </w:t>
-      </w:r>
-      <w:r>
-        <w:rPr>
-          <w:rFonts w:cstheme="minorHAnsi"/>
-          <w:sz w:val="20"/>
-          <w:szCs w:val="20"/>
-        </w:rPr>
-        <w:t xml:space="preserve">4507.02(B). Vehicles registered outside OHIO require special OBMV decal. </w:t>
-      </w:r>
-      <w:r>
-        <w:rPr>
-          <w:rFonts w:cstheme="minorHAnsi"/>
-          <w:sz w:val="20"/>
-          <w:szCs w:val="20"/>
-        </w:rPr>
-        <w:t/>
-      </w:r>
-      <w:r>
-        <w:rPr>
-          <w:rFonts w:cstheme="minorHAnsi"/>
-          <w:sz w:val="20"/>
-          <w:szCs w:val="20"/>
-        </w:rPr>
-        <w:t xml:space="preserve"/>
+        <w:t xml:space="preserve">Restricted Vehicle ID Tags Required. Defendant shall only operate a vehicle with unobscured restricted I.D. tags pursuant to R.C. 4503.2131 and R.C. 4507.02(B). Vehicles registered outside OHIO require special OBMV decal. </w:t>
       </w:r>
     </w:p>
     <w:p>
@@ -1760,104 +1488,7 @@
           <w:sz w:val="20"/>
           <w:szCs w:val="20"/>
         </w:rPr>
-        <w:t xml:space="preserve">Certified Ignition Interlock Device Required. </w:t>
-      </w:r>
-      <w:r>
-        <w:rPr>
-          <w:rFonts w:cstheme="minorHAnsi"/>
-          <w:sz w:val="20"/>
-          <w:szCs w:val="20"/>
-        </w:rPr>
-        <w:t>Defendant</w:t>
-      </w:r>
-      <w:r>
-        <w:rPr>
-          <w:rFonts w:cstheme="minorHAnsi"/>
-          <w:sz w:val="20"/>
-          <w:szCs w:val="20"/>
-        </w:rPr>
-        <w:t xml:space="preserve"> </w:t>
-      </w:r>
-      <w:r>
-        <w:rPr>
-          <w:rFonts w:cstheme="minorHAnsi"/>
-          <w:sz w:val="20"/>
-          <w:szCs w:val="20"/>
-        </w:rPr>
-        <w:t xml:space="preserve">shall </w:t>
-      </w:r>
-      <w:r>
-        <w:rPr>
-          <w:rFonts w:cstheme="minorHAnsi"/>
-          <w:sz w:val="20"/>
-          <w:szCs w:val="20"/>
-        </w:rPr>
-        <w:t>only operate vehicle</w:t>
-      </w:r>
-      <w:r>
-        <w:rPr>
-          <w:rFonts w:cstheme="minorHAnsi"/>
-          <w:sz w:val="20"/>
-          <w:szCs w:val="20"/>
-        </w:rPr>
-        <w:t xml:space="preserve"> equipped with functional, certified ignition interlock device</w:t>
-      </w:r>
-      <w:r>
-        <w:rPr>
-          <w:rFonts w:cstheme="minorHAnsi"/>
-          <w:sz w:val="20"/>
-          <w:szCs w:val="20"/>
-        </w:rPr>
-        <w:t>.</w:t>
-      </w:r>
-      <w:r>
-        <w:rPr>
-          <w:rFonts w:cstheme="minorHAnsi"/>
-          <w:sz w:val="20"/>
-          <w:szCs w:val="20"/>
-        </w:rPr>
-        <w:t xml:space="preserve"> </w:t>
-      </w:r>
-      <w:r>
-        <w:rPr>
-          <w:rFonts w:cstheme="minorHAnsi"/>
-          <w:sz w:val="20"/>
-          <w:szCs w:val="20"/>
-        </w:rPr>
-        <w:t>I</w:t>
-      </w:r>
-      <w:r>
-        <w:rPr>
-          <w:rFonts w:cstheme="minorHAnsi"/>
-          <w:sz w:val="20"/>
-          <w:szCs w:val="20"/>
-        </w:rPr>
-        <w:t xml:space="preserve">f device is circumvented, tampered with, or prevents starting vehicle due to </w:t>
-      </w:r>
-      <w:r>
-        <w:rPr>
-          <w:rFonts w:cstheme="minorHAnsi"/>
-          <w:sz w:val="20"/>
-          <w:szCs w:val="20"/>
-        </w:rPr>
-        <w:lastRenderedPageBreak/>
-        <w:t>alcoholic concentration, the court may double the period that device is required and/or the period of suspension</w:t>
-      </w:r>
-      <w:r>
-        <w:rPr>
-          <w:rFonts w:cstheme="minorHAnsi"/>
-          <w:sz w:val="20"/>
-          <w:szCs w:val="20"/>
-        </w:rPr>
-        <w:t>.</w:t>
-      </w:r>
-      <w:r>
-        <w:rPr>
-          <w:rFonts w:cstheme="minorHAnsi"/>
-          <w:sz w:val="20"/>
-          <w:szCs w:val="20"/>
-        </w:rPr>
-        <w:t xml:space="preserve"> </w:t>
+        <w:t xml:space="preserve">Certified Ignition Interlock Device Required. Defendant shall only operate vehicle equipped with functional, certified ignition interlock device. If device is circumvented, tampered with, or prevents starting vehicle due to alcoholic concentration, the court may double the period that device is required and/or the period of suspension. </w:t>
       </w:r>
     </w:p>
     <w:tbl>
@@ -2072,7 +1703,7 @@
           <w:sz w:val="20"/>
           <w:szCs w:val="20"/>
         </w:rPr>
-        <w:t xml:space="preserve">{{‘\n’}}CONDITIONS AND PRIVILEGES. In addition to the times and locations listed above, </w:t>
+        <w:t xml:space="preserve">CONDITIONS AND PRIVILEGES. In addition to the times and locations listed above, </w:t>
       </w:r>
       <w:r>
         <w:rPr>
@@ -2717,47 +2348,7 @@
                 <w:sz w:val="20"/>
                 <w:szCs w:val="20"/>
               </w:rPr>
-              <w:t xml:space="preserve"/>
-            </w:r>
-            <w:r>
-              <w:rPr>
-                <w:rFonts w:cstheme="minorHAnsi"/>
-                <w:sz w:val="20"/>
-                <w:szCs w:val="20"/>
-              </w:rPr>
               <w:t>Magistrate Amanda D. Bunner</w:t>
-            </w:r>
-            <w:r>
-              <w:rPr>
-                <w:rFonts w:cstheme="minorHAnsi"/>
-                <w:sz w:val="20"/>
-                <w:szCs w:val="20"/>
-              </w:rPr>
-              <w:t xml:space="preserve">Judge </w:t>
-            </w:r>
-            <w:r>
-              <w:rPr>
-                <w:rFonts w:cstheme="minorHAnsi"/>
-                <w:sz w:val="20"/>
-                <w:szCs w:val="20"/>
-              </w:rPr>
-              <w:t>Kyle E. Rohrer</w:t>
-            </w:r>
-            <w:r>
-              <w:rPr>
-                <w:rFonts w:cstheme="minorHAnsi"/>
-                <w:sz w:val="20"/>
-                <w:szCs w:val="20"/>
-              </w:rPr>
-              <w:t xml:space="preserve"> / Judge Mark W. Fowler</w:t>
-            </w:r>
-            <w:r>
-              <w:rPr>
-                <w:rFonts w:cstheme="minorHAnsi"/>
-                <w:sz w:val="20"/>
-                <w:szCs w:val="20"/>
-              </w:rPr>
-              <w:t/>
             </w:r>
           </w:p>
         </w:tc>
@@ -3263,77 +2854,15 @@
         <w:sz w:val="16"/>
         <w:szCs w:val="16"/>
       </w:rPr>
-      <w:t xml:space="preserve">Prepared by {{ </w:t>
+      <w:t xml:space="preserve">Prepared by  Limited Driving Privileges </w:t>
     </w:r>
-    <w:proofErr w:type="spellStart"/>
     <w:r>
       <w:rPr>
         <w:rFonts w:ascii="Palatino Linotype" w:hAnsi="Palatino Linotype"/>
         <w:sz w:val="16"/>
         <w:szCs w:val="16"/>
       </w:rPr>
-      <w:t>judicial_officer.first_name</w:t>
-    </w:r>
-    <w:proofErr w:type="spellEnd"/>
-    <w:r>
-      <w:rPr>
-        <w:rFonts w:ascii="Palatino Linotype" w:hAnsi="Palatino Linotype"/>
-        <w:sz w:val="16"/>
-        <w:szCs w:val="16"/>
-      </w:rPr>
-      <w:t xml:space="preserve"> }} {{ </w:t>
-    </w:r>
-    <w:proofErr w:type="spellStart"/>
-    <w:r>
-      <w:rPr>
-        <w:rFonts w:ascii="Palatino Linotype" w:hAnsi="Palatino Linotype"/>
-        <w:sz w:val="16"/>
-        <w:szCs w:val="16"/>
-      </w:rPr>
-      <w:t>judicial_officer.last_name</w:t>
-    </w:r>
-    <w:proofErr w:type="spellEnd"/>
-    <w:r>
-      <w:rPr>
-        <w:rFonts w:ascii="Palatino Linotype" w:hAnsi="Palatino Linotype"/>
-        <w:sz w:val="16"/>
-        <w:szCs w:val="16"/>
-      </w:rPr>
-      <w:t xml:space="preserve"> }}</w:t>
-    </w:r>
-    <w:r>
-      <w:rPr>
-        <w:rFonts w:ascii="Palatino Linotype" w:hAnsi="Palatino Linotype"/>
-        <w:sz w:val="16"/>
-        <w:szCs w:val="16"/>
-      </w:rPr>
-      <w:tab/>
-    </w:r>
-    <w:r>
-      <w:rPr>
-        <w:rFonts w:ascii="Palatino Linotype" w:hAnsi="Palatino Linotype"/>
-        <w:sz w:val="16"/>
-        <w:szCs w:val="16"/>
-      </w:rPr>
-      <w:t xml:space="preserve">Limited Driving Privileges {{ </w:t>
-    </w:r>
-    <w:proofErr w:type="spellStart"/>
-    <w:r>
-      <w:rPr>
-        <w:rFonts w:ascii="Palatino Linotype" w:hAnsi="Palatino Linotype"/>
-        <w:sz w:val="16"/>
-        <w:szCs w:val="16"/>
-      </w:rPr>
-      <w:t>case_number</w:t>
-    </w:r>
-    <w:proofErr w:type="spellEnd"/>
-    <w:r>
-      <w:rPr>
-        <w:rFonts w:ascii="Palatino Linotype" w:hAnsi="Palatino Linotype"/>
-        <w:sz w:val="16"/>
-        <w:szCs w:val="16"/>
-      </w:rPr>
-      <w:t xml:space="preserve"> }}</w:t>
+      <w:t>{CaseNumber}</w:t>
     </w:r>
   </w:p>
   <w:p>

</xml_diff>